<commit_message>
docs(livrables): phrases d'introduction avant chaque tableau + section Livrables au README
- L2/L3/support : ajout d'une phrase de contexte avant chaque tableau (régénération .docx)
- L3 : correction « deux » → « quatre » parties
- README racine : nouvelle section « Livrables » (liens vers les .docx + échéances)

Co-Authored-By: Claude Opus 4.8 <noreply@anthropic.com>
</commit_message>
<xml_diff>
--- a/livrables/L2-prototype-et-artefacts/L2-Prototype-et-artefacts-NeoTravel.docx
+++ b/livrables/L2-prototype-et-artefacts/L2-Prototype-et-artefacts-NeoTravel.docx
@@ -333,6 +333,14 @@
         <w:t xml:space="preserve">Le prototype couvre l’intégralité du cycle commercial, de la captation du lead au pilotage. Le parcours est démontrable en direct (agent joignable via n8n local + tunnel).</w:t>
       </w:r>
     </w:p>
+    <w:p>
+      <w:pPr>
+        <w:spacing w:after="120"/>
+      </w:pPr>
+      <w:r>
+        <w:t xml:space="preserve">Le tableau suivant récapitule, maillon par maillon, ce que réalise concrètement le prototype et la brique technique qui le porte.</w:t>
+      </w:r>
+    </w:p>
     <w:tbl>
       <w:tblPr>
         <w:tblW w:type="dxa" w:w="9360"/>
@@ -1338,6 +1346,14 @@
         <w:t xml:space="preserve">   (extraction)  (distance)  (PG + Auth + RLS) (emails)</w:t>
       </w:r>
     </w:p>
+    <w:p>
+      <w:pPr>
+        <w:spacing w:after="120"/>
+      </w:pPr>
+      <w:r>
+        <w:t xml:space="preserve">Le tableau ci-dessous précise, pour chaque brique, la technologie retenue et le rôle qu’elle remplit dans l’architecture.</w:t>
+      </w:r>
+    </w:p>
     <w:tbl>
       <w:tblPr>
         <w:tblW w:type="dxa" w:w="9360"/>
@@ -2456,6 +2472,14 @@
         <w:t xml:space="preserve"> (jamais sur le front).</w:t>
       </w:r>
     </w:p>
+    <w:p>
+      <w:pPr>
+        <w:spacing w:after="120"/>
+      </w:pPr>
+      <w:r>
+        <w:t xml:space="preserve">Le tableau ci-dessous regroupe les variables attendues, leur rôle et leur niveau de visibilité — publique (exposée au navigateur), serveur ou secret.</w:t>
+      </w:r>
+    </w:p>
     <w:tbl>
       <w:tblPr>
         <w:tblW w:type="dxa" w:w="9360"/>
@@ -3324,6 +3348,14 @@
         <w:t xml:space="preserve">.</w:t>
       </w:r>
     </w:p>
+    <w:p>
+      <w:pPr>
+        <w:spacing w:after="120"/>
+      </w:pPr>
+      <w:r>
+        <w:t xml:space="preserve">Le tableau suivant détaille les règles effectivement appliquées par le moteur, bloc de calcul par bloc de calcul.</w:t>
+      </w:r>
+    </w:p>
     <w:tbl>
       <w:tblPr>
         <w:tblW w:type="dxa" w:w="9360"/>
@@ -3828,6 +3860,14 @@
       </w:r>
       <w:r>
         <w:t xml:space="preserve">, sans dépendance). Tests front (Vitest) : pricing, distance, PDF, email, relances, noms, messagerie.</w:t>
+      </w:r>
+    </w:p>
+    <w:p>
+      <w:pPr>
+        <w:spacing w:after="120"/>
+      </w:pPr>
+      <w:r>
+        <w:t xml:space="preserve">Le tableau ci-dessous classe les cas vérifiés en cinq familles, des cas nominaux aux cas limites, avec le résultat attendu pour chacune.</w:t>
       </w:r>
     </w:p>
     <w:tbl>
@@ -5272,6 +5312,14 @@
         <w:t xml:space="preserve">9.3 Backlog priorisé</w:t>
       </w:r>
     </w:p>
+    <w:p>
+      <w:pPr>
+        <w:spacing w:after="120"/>
+      </w:pPr>
+      <w:r>
+        <w:t xml:space="preserve">Le backlog est priorisé en trois niveaux, du cœur du MVP (P1) à démontrer en premier, jusqu’aux bonus (P3) :</w:t>
+      </w:r>
+    </w:p>
     <w:tbl>
       <w:tblPr>
         <w:tblW w:type="dxa" w:w="9360"/>
@@ -5524,6 +5572,14 @@
         <w:t xml:space="preserve">9.4 Journal de décisions (extraits) &amp; rétro</w:t>
       </w:r>
     </w:p>
+    <w:p>
+      <w:pPr>
+        <w:spacing w:after="120"/>
+      </w:pPr>
+      <w:r>
+        <w:t xml:space="preserve">Le tableau suivant retrace les principales décisions d’architecture prises pendant la semaine et la raison qui a guidé chaque choix.</w:t>
+      </w:r>
+    </w:p>
     <w:tbl>
       <w:tblPr>
         <w:tblW w:type="dxa" w:w="9360"/>
@@ -5908,6 +5964,14 @@
         <w:t xml:space="preserve">9.5 Répartition des rôles</w:t>
       </w:r>
     </w:p>
+    <w:p>
+      <w:pPr>
+        <w:spacing w:after="120"/>
+      </w:pPr>
+      <w:r>
+        <w:t xml:space="preserve">Le tableau ci-dessous résume la responsabilité principale portée par chaque membre de l’équipe sur le projet.</w:t>
+      </w:r>
+    </w:p>
     <w:tbl>
       <w:tblPr>
         <w:tblW w:type="dxa" w:w="9360"/>
@@ -6187,6 +6251,14 @@
       </w:pPr>
       <w:r>
         <w:t xml:space="preserve">10. Index des artefacts remis (dépôt Git)</w:t>
+      </w:r>
+    </w:p>
+    <w:p>
+      <w:pPr>
+        <w:spacing w:after="120"/>
+      </w:pPr>
+      <w:r>
+        <w:t xml:space="preserve">Le tableau ci-dessous indique, pour chaque artefact remis, son emplacement précis dans le dépôt Git afin de le retrouver rapidement.</w:t>
       </w:r>
     </w:p>
     <w:tbl>

</xml_diff>

<commit_message>
Peaufinage docs + livrables : seuil 55 partout, features integrees, repo nettoye
- Livrables .docx (L1/L2/L3/Support) regeneres : seuil 85->55, paliers capacite,
  + features (signature/CGV, annuaire, messagerie, relance individuelle, geo, courtoisie).
- SCHEMA.md a jour (autocaristes, signature/CGV, msg) + aere (intros avant tableaux).
- DOC_TECHNIQUE : modules (mailer, emailGuard, conversation, noms, statsPdf) + routes
  (devis-messages, admin-messages, autocaristes, devis-acces) + intros tableaux.
- README : note migrations idempotentes (messagerie/signature/autocaristes).
- Prompt systeme n8n + commentaire chat : 85 -> 55.
- CHANGEMENTS_A_INTEGRER.md supprime (contenu integre dans les docs perennes).

Co-Authored-By: Claude Opus 4.8 <noreply@anthropic.com>
</commit_message>
<xml_diff>
--- a/livrables/L2-prototype-et-artefacts/L2-Prototype-et-artefacts-NeoTravel.docx
+++ b/livrables/L2-prototype-et-artefacts/L2-Prototype-et-artefacts-NeoTravel.docx
@@ -3191,7 +3191,7 @@
           <w:sz w:val="18"/>
           <w:szCs w:val="18"/>
         </w:rPr>
-        <w:t xml:space="preserve">  → Escalade : { escalade:true, raison, params }      // &gt; 85 passagers</w:t>
+        <w:t xml:space="preserve">  → Escalade : { escalade:true, raison, params }      // &gt; 55 passagers</w:t>
       </w:r>
     </w:p>
     <w:p>
@@ -3650,7 +3650,7 @@
                 <w:bCs w:val="false"/>
                 <w:color w:val="000000"/>
               </w:rPr>
-              <w:t xml:space="preserve">≤19 −5 % · ≤53 0 % · ≤63 +15 % · ≤67 +20 % · ≤85 +40 %</w:t>
+              <w:t xml:space="preserve">≤19 −5 % · ≤53 0 % · ≤55 +15 % (autocar plein)</w:t>
             </w:r>
           </w:p>
         </w:tc>
@@ -3818,7 +3818,7 @@
                 <w:bCs w:val="false"/>
                 <w:color w:val="000000"/>
               </w:rPr>
-              <w:t xml:space="preserve">&gt; 85 passagers → pas de devis auto, bascule humaine (HITL)</w:t>
+              <w:t xml:space="preserve">&gt; 55 passagers → pas de devis auto, bascule humaine (HITL)</w:t>
             </w:r>
           </w:p>
         </w:tc>
@@ -4190,7 +4190,7 @@
                 <w:bCs w:val="false"/>
                 <w:color w:val="000000"/>
               </w:rPr>
-              <w:t xml:space="preserve">&gt; 85 passagers</w:t>
+              <w:t xml:space="preserve">&gt; 55 passagers</w:t>
             </w:r>
           </w:p>
         </w:tc>
@@ -4684,7 +4684,7 @@
           <w:sz w:val="18"/>
           <w:szCs w:val="18"/>
         </w:rPr>
-        <w:t xml:space="preserve">  une remise, tu refuses poliment ; au-delà de 85 passagers ou cas</w:t>
+        <w:t xml:space="preserve">  une remise, tu refuses poliment ; au-delà de 55 passagers ou cas</w:t>
       </w:r>
     </w:p>
     <w:p>
@@ -4865,6 +4865,32 @@
     </w:p>
     <w:p>
       <w:pPr>
+        <w:pStyle w:val="ListParagraph"/>
+        <w:numPr>
+          <w:ilvl w:val="0"/>
+          <w:numId w:val="2"/>
+        </w:numPr>
+        <w:spacing w:after="60"/>
+      </w:pPr>
+      <w:r>
+        <w:t xml:space="preserve">Relance individuelle d’un devis en un clic, en plus du traitement par lots.</w:t>
+      </w:r>
+    </w:p>
+    <w:p>
+      <w:pPr>
+        <w:pStyle w:val="ListParagraph"/>
+        <w:numPr>
+          <w:ilvl w:val="0"/>
+          <w:numId w:val="2"/>
+        </w:numPr>
+        <w:spacing w:after="60"/>
+      </w:pPr>
+      <w:r>
+        <w:t xml:space="preserve">Annuaire des autocaristes partenaires (/admin/autocaristes) : flotte, capacité, zone, contact.</w:t>
+      </w:r>
+    </w:p>
+    <w:p>
+      <w:pPr>
         <w:pStyle w:val="Heading2"/>
       </w:pPr>
       <w:r>
@@ -4907,6 +4933,62 @@
       </w:r>
       <w:r>
         <w:t xml:space="preserve">, puis clôture ; expiration des devis à 30 jours. Déclenchables automatiquement (n8n) ou manuellement (bouton admin « Lancer les relances dues »). Idempotence garantie par une clé unique (pas de doublon).</w:t>
+      </w:r>
+    </w:p>
+    <w:p>
+      <w:pPr>
+        <w:pStyle w:val="Heading2"/>
+      </w:pPr>
+      <w:r>
+        <w:t xml:space="preserve">7.3 Acceptation (signature électronique) &amp; refus</w:t>
+      </w:r>
+    </w:p>
+    <w:p>
+      <w:pPr>
+        <w:spacing w:after="120"/>
+      </w:pPr>
+      <w:r>
+        <w:t xml:space="preserve">À l’acceptation, le client appose une </w:t>
+      </w:r>
+      <w:r>
+        <w:rPr>
+          <w:b/>
+          <w:bCs/>
+        </w:rPr>
+        <w:t xml:space="preserve">signature électronique simple</w:t>
+      </w:r>
+      <w:r>
+        <w:t xml:space="preserve"> (tracé manuscrit), saisit son nom et coche les </w:t>
+      </w:r>
+      <w:r>
+        <w:rPr>
+          <w:b/>
+          <w:bCs/>
+        </w:rPr>
+        <w:t xml:space="preserve">CGV</w:t>
+      </w:r>
+      <w:r>
+        <w:t xml:space="preserve"> ; la signature horodatée est conservée et </w:t>
+      </w:r>
+      <w:r>
+        <w:rPr>
+          <w:b/>
+          <w:bCs/>
+        </w:rPr>
+        <w:t xml:space="preserve">apposée sur le PDF</w:t>
+      </w:r>
+      <w:r>
+        <w:t xml:space="preserve"> du devis. En cas de refus, un </w:t>
+      </w:r>
+      <w:r>
+        <w:rPr>
+          <w:b/>
+          <w:bCs/>
+        </w:rPr>
+        <w:t xml:space="preserve">email de courtoisie</w:t>
+      </w:r>
+      <w:r>
+        <w:t xml:space="preserve"> remercie le client et l’invite à revenir — la traçabilité (motif) est conservée.</w:t>
       </w:r>
     </w:p>
     <w:p>
@@ -4987,7 +5069,7 @@
         <w:spacing w:after="120"/>
       </w:pPr>
       <w:r>
-        <w:t xml:space="preserve">Couverts par le moteur (cf. §5.4) et démontrables en live : demande simple complète, incomplète, urgente, gros volume, 0 passager, date incohérente, trajet long, option nuit chauffeur, et cas complexe (&gt; 85 pax).</w:t>
+        <w:t xml:space="preserve">Couverts par le moteur (cf. §5.4) et démontrables en live : demande simple complète, incomplète, urgente, gros volume, 0 passager, date incohérente (retour avant départ), trajet long, option nuit chauffeur, et cas complexe (&gt; 55 pax). Deux règles géographiques complètent le dispositif : un trajet hors France bascule en cas complexe (transfrontalier), et deux communes homonymes déclenchent une demande de code postal.</w:t>
       </w:r>
     </w:p>
     <w:p>
@@ -5003,7 +5085,7 @@
         <w:spacing w:after="120"/>
       </w:pPr>
       <w:r>
-        <w:t xml:space="preserve">Au-delà de 85 passagers ou pour un cas atypique, le système </w:t>
+        <w:t xml:space="preserve">Au-delà de 55 passagers ou pour un cas atypique, le système </w:t>
       </w:r>
       <w:r>
         <w:rPr>

</xml_diff>

<commit_message>
Barème conforme au doc officiel : seuil 85 + paliers capacité complets
Retour au Tableau 2c officiel : escalade > 85 passagers et paliers
≤19 -5% · ≤53 0% · ≤63 +15% · ≤67 +20% · ≤85 +40%.
Propagé partout : moteur (calculerDevis.ts, pricing/), n8n (build + workflow),
pricing_config (schema.sql, reset-complet.sql), seed (générateur + SQL régénéré),
tests (front + pricing), docs (DOC_TECHNIQUE, DIAGRAMMES, SCHEMA, pricing/README,
SCRIPT_DEMO, TESTS_OBLIGATOIRES), SVG (archi + BDD) et livrables .docx (régénérés).
Options inchangées (guide 80€/j, nuit 120€/nuit) — déjà conformes.

Co-Authored-By: Claude Opus 4.8 <noreply@anthropic.com>
</commit_message>
<xml_diff>
--- a/livrables/L2-prototype-et-artefacts/L2-Prototype-et-artefacts-NeoTravel.docx
+++ b/livrables/L2-prototype-et-artefacts/L2-Prototype-et-artefacts-NeoTravel.docx
@@ -3191,7 +3191,7 @@
           <w:sz w:val="18"/>
           <w:szCs w:val="18"/>
         </w:rPr>
-        <w:t xml:space="preserve">  → Escalade : { escalade:true, raison, params }      // &gt; 55 passagers</w:t>
+        <w:t xml:space="preserve">  → Escalade : { escalade:true, raison, params }      // &gt; 85 passagers</w:t>
       </w:r>
     </w:p>
     <w:p>
@@ -3650,7 +3650,7 @@
                 <w:bCs w:val="false"/>
                 <w:color w:val="000000"/>
               </w:rPr>
-              <w:t xml:space="preserve">≤19 −5 % · ≤53 0 % · ≤55 +15 % (autocar plein)</w:t>
+              <w:t xml:space="preserve">≤19 −5 % · ≤53 0 % · ≤63 +15 % · ≤67 +20 % · ≤85 +40 %</w:t>
             </w:r>
           </w:p>
         </w:tc>
@@ -3818,7 +3818,7 @@
                 <w:bCs w:val="false"/>
                 <w:color w:val="000000"/>
               </w:rPr>
-              <w:t xml:space="preserve">&gt; 55 passagers → pas de devis auto, bascule humaine (HITL)</w:t>
+              <w:t xml:space="preserve">&gt; 85 passagers → pas de devis auto, bascule humaine (HITL)</w:t>
             </w:r>
           </w:p>
         </w:tc>
@@ -4190,7 +4190,7 @@
                 <w:bCs w:val="false"/>
                 <w:color w:val="000000"/>
               </w:rPr>
-              <w:t xml:space="preserve">&gt; 55 passagers</w:t>
+              <w:t xml:space="preserve">&gt; 85 passagers</w:t>
             </w:r>
           </w:p>
         </w:tc>
@@ -4684,7 +4684,7 @@
           <w:sz w:val="18"/>
           <w:szCs w:val="18"/>
         </w:rPr>
-        <w:t xml:space="preserve">  une remise, tu refuses poliment ; au-delà de 55 passagers ou cas</w:t>
+        <w:t xml:space="preserve">  une remise, tu refuses poliment ; au-delà de 85 passagers ou cas</w:t>
       </w:r>
     </w:p>
     <w:p>
@@ -5069,7 +5069,7 @@
         <w:spacing w:after="120"/>
       </w:pPr>
       <w:r>
-        <w:t xml:space="preserve">Couverts par le moteur (cf. §5.4) et démontrables en live : demande simple complète, incomplète, urgente, gros volume, 0 passager, date incohérente (retour avant départ), trajet long, option nuit chauffeur, et cas complexe (&gt; 55 pax). Deux règles géographiques complètent le dispositif : un trajet hors France bascule en cas complexe (transfrontalier), et deux communes homonymes déclenchent une demande de code postal.</w:t>
+        <w:t xml:space="preserve">Couverts par le moteur (cf. §5.4) et démontrables en live : demande simple complète, incomplète, urgente, gros volume, 0 passager, date incohérente (retour avant départ), trajet long, option nuit chauffeur, et cas complexe (&gt; 85 pax). Deux règles géographiques complètent le dispositif : un trajet hors France bascule en cas complexe (transfrontalier), et deux communes homonymes déclenchent une demande de code postal.</w:t>
       </w:r>
     </w:p>
     <w:p>
@@ -5085,7 +5085,7 @@
         <w:spacing w:after="120"/>
       </w:pPr>
       <w:r>
-        <w:t xml:space="preserve">Au-delà de 55 passagers ou pour un cas atypique, le système </w:t>
+        <w:t xml:space="preserve">Au-delà de 85 passagers ou pour un cas atypique, le système </w:t>
       </w:r>
       <w:r>
         <w:rPr>

</xml_diff>